<commit_message>
Skript 3 und Lernseite 3: Ergänzungen passend zu den neuen Folien
- Skript 03: Originaltext unverändert; fünf Kästen „Ergänzung zur Vorlesung“
  (British Airways 2017, CrowdStrike 2024 mit zeitlicher Diversität,
  Rackspace 2022, Netflix 2011, Facebook 2021) und vier Abbildungen
- Lernseite 03: Lernziele erweitert, Fallbeispiele und sechs Abbildungen,
  Irrtümer mit Gegenbeispielen, Übungsdauer 20–30 Minuten, Hausaufgabe
- Skript-03 als HTML, PDF und Word neu erzeugt (PDF mit Ersatzschrift Carlito)

Co-Authored-By: Claude Opus 5.5 <noreply@anthropic.com>
Claude-Session: https://claude.ai/code/session_01CiDofemQVGAuKuex8NzNEd
</commit_message>
<xml_diff>
--- a/_output/skripte/Skript-03.docx
+++ b/_output/skripte/Skript-03.docx
@@ -57,10 +57,10 @@
         <w:pStyle w:val="BodyText"/>
       </w:pPr>
       <w:r>
-        <w:t xml:space="preserve">Die mit „Hinweis zur Aktualität“ markierten Kästen wurden bei der Überführung ins Quarto-Projekt ergänzt. Der übrige Text entspricht dem Skript aus dem Wintersemester 2025/26; korrigiert wurden nur Tipp- und Umbruchfehler.</w:t>
-      </w:r>
-    </w:p>
-    <w:bookmarkStart w:id="19" w:name="einleitung-und-zielsetzung-der-sitzung"/>
+        <w:t xml:space="preserve">Die mit „Hinweis zur Aktualität“ und „Ergänzung zur Vorlesung“ markierten Kästen sowie die Abbildungen wurden bei der Überführung ins Quarto-Projekt ergänzt. Der übrige Text entspricht dem Skript aus dem Wintersemester 2025/26; korrigiert wurden nur Tipp- und Umbruchfehler.</w:t>
+      </w:r>
+    </w:p>
+    <w:bookmarkStart w:id="22" w:name="einleitung-und-zielsetzung-der-sitzung"/>
     <w:p>
       <w:pPr>
         <w:pStyle w:val="Heading1"/>
@@ -201,8 +201,63 @@
         <w:t xml:space="preserve">. Im Anschluss erfolgt eine Übung zur Identifikation und Einordnung von Single Points of Failure (SPOFs) in realen Systembeispielen.</w:t>
       </w:r>
     </w:p>
-    <w:bookmarkEnd w:id="19"/>
-    <w:bookmarkStart w:id="23" w:name="X2454f511463af4e346f2f6b3a82776ccd0aacbe"/>
+    <w:p>
+      <w:pPr>
+        <w:pStyle w:val="CaptionedFigure"/>
+      </w:pPr>
+      <w:r>
+        <w:drawing>
+          <wp:inline>
+            <wp:extent cx="4314825" cy="2981846"/>
+            <wp:effectExtent b="0" l="0" r="0" t="0"/>
+            <wp:docPr descr="Wirkung der Architekturprinzipien auf die Resilienzkurve aus Sitzung 2" title="" id="20" name="Picture"/>
+            <a:graphic>
+              <a:graphicData uri="http://schemas.openxmlformats.org/drawingml/2006/picture">
+                <pic:pic>
+                  <pic:nvPicPr>
+                    <pic:cNvPr descr="../Präsentationen/Termin-03/assets/prinzipien-wirkung.png" id="21" name="Picture"/>
+                    <pic:cNvPicPr>
+                      <a:picLocks noChangeArrowheads="1" noChangeAspect="1"/>
+                    </pic:cNvPicPr>
+                  </pic:nvPicPr>
+                  <pic:blipFill>
+                    <a:blip r:embed="rId19"/>
+                    <a:stretch>
+                      <a:fillRect/>
+                    </a:stretch>
+                  </pic:blipFill>
+                  <pic:spPr bwMode="auto">
+                    <a:xfrm>
+                      <a:off x="0" y="0"/>
+                      <a:ext cx="4314825" cy="2981846"/>
+                    </a:xfrm>
+                    <a:prstGeom prst="rect">
+                      <a:avLst/>
+                    </a:prstGeom>
+                    <a:noFill/>
+                    <a:ln w="9525">
+                      <a:noFill/>
+                      <a:headEnd/>
+                      <a:tailEnd/>
+                    </a:ln>
+                  </pic:spPr>
+                </pic:pic>
+              </a:graphicData>
+            </a:graphic>
+          </wp:inline>
+        </w:drawing>
+      </w:r>
+    </w:p>
+    <w:p>
+      <w:pPr>
+        <w:pStyle w:val="ImageCaption"/>
+      </w:pPr>
+      <w:r>
+        <w:t xml:space="preserve">Wirkung der Architekturprinzipien auf die Resilienzkurve aus Sitzung 2</w:t>
+      </w:r>
+    </w:p>
+    <w:bookmarkEnd w:id="22"/>
+    <w:bookmarkStart w:id="30" w:name="X2454f511463af4e346f2f6b3a82776ccd0aacbe"/>
     <w:p>
       <w:pPr>
         <w:pStyle w:val="Heading1"/>
@@ -219,7 +274,7 @@
         <w:t xml:space="preserve">Redundanz bezeichnet die vorsätzliche Mehrfachvorhaltung kritischer Ressourcen mit dem Ziel, einzelne Komponenten ausfallen zu lassen, ohne dass das Gesamtsystem seine Funktion verliert. Sie ist damit das älteste und zugleich fundamentalste technische Resilienzprinzip.</w:t>
       </w:r>
     </w:p>
-    <w:bookmarkStart w:id="20" w:name="X20d62a52c4f68f0ad29953b2377990dd52f4876"/>
+    <w:bookmarkStart w:id="23" w:name="X20d62a52c4f68f0ad29953b2377990dd52f4876"/>
     <w:p>
       <w:pPr>
         <w:pStyle w:val="Heading2"/>
@@ -328,8 +383,8 @@
         <w:t xml:space="preserve">Die Ausfallsicherheit steigt proportional zum Grad der Entkopplung. Zwei USVs im gleichen Brandabschnitt sind keine Resilienz, sondern Redundanz ohne Isolation.</w:t>
       </w:r>
     </w:p>
-    <w:bookmarkEnd w:id="20"/>
-    <w:bookmarkStart w:id="21" w:name="X8df85f50dfc19c7cbeefcd34d548433aeb1cf40"/>
+    <w:bookmarkEnd w:id="23"/>
+    <w:bookmarkStart w:id="24" w:name="X8df85f50dfc19c7cbeefcd34d548433aeb1cf40"/>
     <w:p>
       <w:pPr>
         <w:pStyle w:val="Heading2"/>
@@ -446,8 +501,8 @@
         <w:t xml:space="preserve">— sie muss im Architekturentwurf aktiviert werden.</w:t>
       </w:r>
     </w:p>
-    <w:bookmarkEnd w:id="21"/>
-    <w:bookmarkStart w:id="22" w:name="grenzen-der-redundanz"/>
+    <w:bookmarkEnd w:id="24"/>
+    <w:bookmarkStart w:id="29" w:name="grenzen-der-redundanz"/>
     <w:p>
       <w:pPr>
         <w:pStyle w:val="Heading2"/>
@@ -558,9 +613,158 @@
         <w:t xml:space="preserve">darstellt.</w:t>
       </w:r>
     </w:p>
-    <w:bookmarkEnd w:id="22"/>
-    <w:bookmarkEnd w:id="23"/>
-    <w:bookmarkStart w:id="27" w:name="X4f60ceefbac3e61f0f3703498ded8df3bb2c273"/>
+    <w:tbl>
+      <w:tblPr>
+        <w:tblStyle w:val="Table"/>
+        <w:tblLook w:firstRow="0" w:lastRow="0" w:firstColumn="0" w:lastColumn="0" w:noHBand="0" w:noVBand="0" w:val="0000"/>
+        <w:tblBorders>
+          <w:top w:val="single" w:sz="4" w:space="0" w:color="00A047"/>
+          <w:left w:val="single" w:sz="24" w:space="0" w:color="00A047"/>
+          <w:bottom w:val="single" w:sz="4" w:space="0" w:color="00A047"/>
+          <w:right w:val="single" w:sz="4" w:space="0" w:color="00A047"/>
+        </w:tblBorders>
+        <w:tblCellMar>
+          <w:left w:w="144" w:type="dxa"/>
+          <w:right w:w="144" w:type="dxa"/>
+        </w:tblCellMar>
+        <w:tblLook w:firstRow="0" w:lastRow="0" w:firstColumn="0" w:lastColumn="0" w:noHBand="0" w:noVBand="0" w:val="0000"/>
+      </w:tblPr>
+      <w:tr>
+        <w:trPr>
+          <w:cantSplit/>
+        </w:trPr>
+        <w:tc>
+          <w:tcPr>
+            <w:shd w:color="auto" w:fill="ccf1e3" w:val="clear"/>
+            <w:tcMar>
+              <w:top w:w="92" w:type="dxa"/>
+              <w:bottom w:w="92" w:type="dxa"/>
+            </w:tcMar>
+          </w:tcPr>
+          <w:p>
+            <w:pPr>
+              <w:pStyle w:val="BodyText"/>
+            </w:pPr>
+            <w:pPr>
+              <w:spacing w:before="0" w:after="0"/>
+              <w:textAlignment w:val="center"/>
+            </w:pPr>
+            <w:r>
+              <w:drawing>
+                <wp:inline>
+                  <wp:extent cx="152400" cy="152400"/>
+                  <wp:effectExtent b="0" l="0" r="0" t="0"/>
+                  <wp:docPr descr="" title="" id="26" name="Picture"/>
+                  <a:graphic>
+                    <a:graphicData uri="http://schemas.openxmlformats.org/drawingml/2006/picture">
+                      <pic:pic>
+                        <pic:nvPicPr>
+                          <pic:cNvPr descr="/usr/local/lib/python3.13/dist-packages/quarto_cli/share/formats/docx/tip.png" id="27" name="Picture"/>
+                          <pic:cNvPicPr>
+                            <a:picLocks noChangeArrowheads="1" noChangeAspect="1"/>
+                          </pic:cNvPicPr>
+                        </pic:nvPicPr>
+                        <pic:blipFill>
+                          <a:blip r:embed="rId25"/>
+                          <a:stretch>
+                            <a:fillRect/>
+                          </a:stretch>
+                        </pic:blipFill>
+                        <pic:spPr bwMode="auto">
+                          <a:xfrm>
+                            <a:off x="0" y="0"/>
+                            <a:ext cx="152400" cy="152400"/>
+                          </a:xfrm>
+                          <a:prstGeom prst="rect">
+                            <a:avLst/>
+                          </a:prstGeom>
+                          <a:noFill/>
+                          <a:ln w="9525">
+                            <a:noFill/>
+                            <a:headEnd/>
+                            <a:tailEnd/>
+                          </a:ln>
+                        </pic:spPr>
+                      </pic:pic>
+                    </a:graphicData>
+                  </a:graphic>
+                </wp:inline>
+              </w:drawing>
+            </w:r>
+            <w:r>
+              <w:t xml:space="preserve"> </w:t>
+            </w:r>
+            <w:r>
+              <w:t xml:space="preserve"> </w:t>
+            </w:r>
+            <w:r>
+              <w:t xml:space="preserve">Ergänzung zur Vorlesung: British Airways 2017</w:t>
+            </w:r>
+          </w:p>
+        </w:tc>
+      </w:tr>
+      <w:tr>
+        <w:trPr>
+          <w:cantSplit/>
+        </w:trPr>
+        <w:tc>
+          <w:tcPr>
+            <w:tcMar>
+              <w:top w:w="108" w:type="dxa"/>
+              <w:bottom w:w="108" w:type="dxa"/>
+            </w:tcMar>
+          </w:tcPr>
+          <w:p>
+            <w:pPr>
+              <w:pStyle w:val="BodyText"/>
+            </w:pPr>
+            <w:pPr>
+              <w:spacing w:before="16"/>
+            </w:pPr>
+            <w:r>
+              <w:t xml:space="preserve">Am 27. Mai 2017 trennte ein Techniker in einem Rechenzentrum bei Heathrow die Stromversorgung. Beim Wiederzuschalten beschädigte eine Überspannung die IT-Systeme, und die Ausweichsysteme übernahmen nicht. Check-in, Gepäckabfertigung und Flugplanung fielen aus; allein am ersten Tag strich British Airways 479 Flüge, mindestens 75.000 Passagiere waren betroffen, die Kosten wurden auf bis zu 100 Mio. € geschätzt. Warum die Ausweichsysteme nicht griffen, wurde öffentlich nie vollständig geklärt.</w:t>
+            </w:r>
+          </w:p>
+          <w:p>
+            <w:pPr>
+              <w:pStyle w:val="BodyText"/>
+            </w:pPr>
+            <w:r>
+              <w:t xml:space="preserve">Der Fall zeigt zwei Grenzen der Redundanz zugleich: eine gemeinsame Abhängigkeit (die Stromversorgung) und eine Umschaltung, die unter realen Bedingungen nicht funktionierte.</w:t>
+            </w:r>
+          </w:p>
+          <w:p>
+            <w:pPr>
+              <w:pStyle w:val="BodyText"/>
+            </w:pPr>
+            <w:pPr>
+              <w:spacing w:after="16"/>
+            </w:pPr>
+            <w:r>
+              <w:t xml:space="preserve">Quellenangaben unter</w:t>
+            </w:r>
+            <w:r>
+              <w:t xml:space="preserve"> </w:t>
+            </w:r>
+            <w:hyperlink r:id="rId28">
+              <w:r>
+                <w:rPr>
+                  <w:rStyle w:val="Hyperlink"/>
+                </w:rPr>
+                <w:t xml:space="preserve">Quellen</w:t>
+              </w:r>
+            </w:hyperlink>
+            <w:r>
+              <w:t xml:space="preserve">.</w:t>
+            </w:r>
+          </w:p>
+          <w:p/>
+        </w:tc>
+      </w:tr>
+    </w:tbl>
+    <w:bookmarkEnd w:id="29"/>
+    <w:bookmarkEnd w:id="30"/>
+    <w:bookmarkStart w:id="39" w:name="X4f60ceefbac3e61f0f3703498ded8df3bb2c273"/>
     <w:p>
       <w:pPr>
         <w:pStyle w:val="Heading1"/>
@@ -593,7 +797,7 @@
         <w:t xml:space="preserve">(Common Mode Failures) zu vermeiden. Systeme, die redundant, aber homogen sind, teilen dieselben Schwachstellen und können daher simultan scheitern.</w:t>
       </w:r>
     </w:p>
-    <w:bookmarkStart w:id="24" w:name="formen-technischer-diversität"/>
+    <w:bookmarkStart w:id="36" w:name="formen-technischer-diversität"/>
     <w:p>
       <w:pPr>
         <w:pStyle w:val="Heading2"/>
@@ -698,8 +902,225 @@
         <w:t xml:space="preserve">.</w:t>
       </w:r>
     </w:p>
-    <w:bookmarkEnd w:id="24"/>
-    <w:bookmarkStart w:id="25" w:name="Xdac70d1d4b2071055e67e52da610f860c336822"/>
+    <w:tbl>
+      <w:tblPr>
+        <w:tblStyle w:val="Table"/>
+        <w:tblLook w:firstRow="0" w:lastRow="0" w:firstColumn="0" w:lastColumn="0" w:noHBand="0" w:noVBand="0" w:val="0000"/>
+        <w:tblBorders>
+          <w:top w:val="single" w:sz="4" w:space="0" w:color="00A047"/>
+          <w:left w:val="single" w:sz="24" w:space="0" w:color="00A047"/>
+          <w:bottom w:val="single" w:sz="4" w:space="0" w:color="00A047"/>
+          <w:right w:val="single" w:sz="4" w:space="0" w:color="00A047"/>
+        </w:tblBorders>
+        <w:tblCellMar>
+          <w:left w:w="144" w:type="dxa"/>
+          <w:right w:w="144" w:type="dxa"/>
+        </w:tblCellMar>
+        <w:tblLook w:firstRow="0" w:lastRow="0" w:firstColumn="0" w:lastColumn="0" w:noHBand="0" w:noVBand="0" w:val="0000"/>
+      </w:tblPr>
+      <w:tr>
+        <w:trPr>
+          <w:cantSplit/>
+        </w:trPr>
+        <w:tc>
+          <w:tcPr>
+            <w:shd w:color="auto" w:fill="ccf1e3" w:val="clear"/>
+            <w:tcMar>
+              <w:top w:w="92" w:type="dxa"/>
+              <w:bottom w:w="92" w:type="dxa"/>
+            </w:tcMar>
+          </w:tcPr>
+          <w:p>
+            <w:pPr>
+              <w:pStyle w:val="BodyText"/>
+            </w:pPr>
+            <w:pPr>
+              <w:spacing w:before="0" w:after="0"/>
+              <w:textAlignment w:val="center"/>
+            </w:pPr>
+            <w:r>
+              <w:drawing>
+                <wp:inline>
+                  <wp:extent cx="152400" cy="152400"/>
+                  <wp:effectExtent b="0" l="0" r="0" t="0"/>
+                  <wp:docPr descr="" title="" id="31" name="Picture"/>
+                  <a:graphic>
+                    <a:graphicData uri="http://schemas.openxmlformats.org/drawingml/2006/picture">
+                      <pic:pic>
+                        <pic:nvPicPr>
+                          <pic:cNvPr descr="/usr/local/lib/python3.13/dist-packages/quarto_cli/share/formats/docx/tip.png" id="32" name="Picture"/>
+                          <pic:cNvPicPr>
+                            <a:picLocks noChangeArrowheads="1" noChangeAspect="1"/>
+                          </pic:cNvPicPr>
+                        </pic:nvPicPr>
+                        <pic:blipFill>
+                          <a:blip r:embed="rId25"/>
+                          <a:stretch>
+                            <a:fillRect/>
+                          </a:stretch>
+                        </pic:blipFill>
+                        <pic:spPr bwMode="auto">
+                          <a:xfrm>
+                            <a:off x="0" y="0"/>
+                            <a:ext cx="152400" cy="152400"/>
+                          </a:xfrm>
+                          <a:prstGeom prst="rect">
+                            <a:avLst/>
+                          </a:prstGeom>
+                          <a:noFill/>
+                          <a:ln w="9525">
+                            <a:noFill/>
+                            <a:headEnd/>
+                            <a:tailEnd/>
+                          </a:ln>
+                        </pic:spPr>
+                      </pic:pic>
+                    </a:graphicData>
+                  </a:graphic>
+                </wp:inline>
+              </w:drawing>
+            </w:r>
+            <w:r>
+              <w:t xml:space="preserve"> </w:t>
+            </w:r>
+            <w:r>
+              <w:t xml:space="preserve"> </w:t>
+            </w:r>
+            <w:r>
+              <w:t xml:space="preserve">Ergänzung zur Vorlesung: CrowdStrike 2024</w:t>
+            </w:r>
+          </w:p>
+        </w:tc>
+      </w:tr>
+      <w:tr>
+        <w:trPr>
+          <w:cantSplit/>
+        </w:trPr>
+        <w:tc>
+          <w:tcPr>
+            <w:tcMar>
+              <w:top w:w="108" w:type="dxa"/>
+              <w:bottom w:w="108" w:type="dxa"/>
+            </w:tcMar>
+          </w:tcPr>
+          <w:p>
+            <w:pPr>
+              <w:pStyle w:val="BodyText"/>
+            </w:pPr>
+            <w:pPr>
+              <w:spacing w:before="16"/>
+            </w:pPr>
+            <w:r>
+              <w:t xml:space="preserve">Am 19. Juli 2024 verteilte CrowdStrike ein fehlerhaftes Konfigurations-Update für seinen Windows-Sensor. Nach Angaben von Microsoft stürzten rund 8,5 Mio. Windows-Rechner ab – weniger als 1 % aller Windows-Geräte, aber konzentriert in Unternehmen mit hohem Schutzbedarf. Flughäfen, Krankenhäuser, Banken und Sender standen still; viele Rechner mussten von Hand repariert werden. Hochverfügbare Cluster halfen nicht, weil alle Knoten denselben Agenten verwendeten: ein Common-Mode-Failure im Lehrbuchsinn.</w:t>
+            </w:r>
+          </w:p>
+          <w:p>
+            <w:pPr>
+              <w:pStyle w:val="BodyText"/>
+            </w:pPr>
+            <w:r>
+              <w:t xml:space="preserve">Der Fall ergänzt die drei Formen der Diversität um eine vierte, die</w:t>
+            </w:r>
+            <w:r>
+              <w:t xml:space="preserve"> </w:t>
+            </w:r>
+            <w:r>
+              <w:rPr>
+                <w:b/>
+                <w:bCs/>
+              </w:rPr>
+              <w:t xml:space="preserve">zeitliche Diversität</w:t>
+            </w:r>
+            <w:r>
+              <w:t xml:space="preserve">: Gestaffelte Rollouts (Canary) verteilen eine Änderung erst auf wenige Systeme und dann auf alle, sodass ein Fehler nicht überall gleichzeitig wirkt. CrowdStrike hat als Konsequenz eine solche gestaffelte Auslieferung angekündigt.</w:t>
+            </w:r>
+          </w:p>
+          <w:p>
+            <w:pPr>
+              <w:pStyle w:val="BodyText"/>
+            </w:pPr>
+            <w:pPr>
+              <w:spacing w:after="16"/>
+            </w:pPr>
+            <w:r>
+              <w:t xml:space="preserve">Quellenangaben unter</w:t>
+            </w:r>
+            <w:r>
+              <w:t xml:space="preserve"> </w:t>
+            </w:r>
+            <w:hyperlink r:id="rId28">
+              <w:r>
+                <w:rPr>
+                  <w:rStyle w:val="Hyperlink"/>
+                </w:rPr>
+                <w:t xml:space="preserve">Quellen</w:t>
+              </w:r>
+            </w:hyperlink>
+            <w:r>
+              <w:t xml:space="preserve">.</w:t>
+            </w:r>
+          </w:p>
+          <w:p/>
+        </w:tc>
+      </w:tr>
+    </w:tbl>
+    <w:p>
+      <w:pPr>
+        <w:pStyle w:val="CaptionedFigure"/>
+      </w:pPr>
+      <w:r>
+        <w:drawing>
+          <wp:inline>
+            <wp:extent cx="4314825" cy="3288045"/>
+            <wp:effectExtent b="0" l="0" r="0" t="0"/>
+            <wp:docPr descr="Redundant, aber gleich gegenüber redundant und divers" title="" id="34" name="Picture"/>
+            <a:graphic>
+              <a:graphicData uri="http://schemas.openxmlformats.org/drawingml/2006/picture">
+                <pic:pic>
+                  <pic:nvPicPr>
+                    <pic:cNvPr descr="../Präsentationen/Termin-03/assets/crowdstrike-common-mode.png" id="35" name="Picture"/>
+                    <pic:cNvPicPr>
+                      <a:picLocks noChangeArrowheads="1" noChangeAspect="1"/>
+                    </pic:cNvPicPr>
+                  </pic:nvPicPr>
+                  <pic:blipFill>
+                    <a:blip r:embed="rId33"/>
+                    <a:stretch>
+                      <a:fillRect/>
+                    </a:stretch>
+                  </pic:blipFill>
+                  <pic:spPr bwMode="auto">
+                    <a:xfrm>
+                      <a:off x="0" y="0"/>
+                      <a:ext cx="4314825" cy="3288045"/>
+                    </a:xfrm>
+                    <a:prstGeom prst="rect">
+                      <a:avLst/>
+                    </a:prstGeom>
+                    <a:noFill/>
+                    <a:ln w="9525">
+                      <a:noFill/>
+                      <a:headEnd/>
+                      <a:tailEnd/>
+                    </a:ln>
+                  </pic:spPr>
+                </pic:pic>
+              </a:graphicData>
+            </a:graphic>
+          </wp:inline>
+        </w:drawing>
+      </w:r>
+    </w:p>
+    <w:p>
+      <w:pPr>
+        <w:pStyle w:val="ImageCaption"/>
+      </w:pPr>
+      <w:r>
+        <w:t xml:space="preserve">Redundant, aber gleich gegenüber redundant und divers</w:t>
+      </w:r>
+    </w:p>
+    <w:bookmarkEnd w:id="36"/>
+    <w:bookmarkStart w:id="37" w:name="Xdac70d1d4b2071055e67e52da610f860c336822"/>
     <w:p>
       <w:pPr>
         <w:pStyle w:val="Heading2"/>
@@ -724,8 +1145,8 @@
         <w:t xml:space="preserve">Ein divers gelagerter Technologie-Stack wirkt wie ein „Brandschott“ gegen seitliche Ausbreitung (vgl. ENISA-Supply-Chain-Guidance).</w:t>
       </w:r>
     </w:p>
-    <w:bookmarkEnd w:id="25"/>
-    <w:bookmarkStart w:id="26" w:name="kosten--und-komplexitätsaspekte"/>
+    <w:bookmarkEnd w:id="37"/>
+    <w:bookmarkStart w:id="38" w:name="kosten--und-komplexitätsaspekte"/>
     <w:p>
       <w:pPr>
         <w:pStyle w:val="Heading2"/>
@@ -787,9 +1208,9 @@
         <w:t xml:space="preserve">.</w:t>
       </w:r>
     </w:p>
-    <w:bookmarkEnd w:id="26"/>
-    <w:bookmarkEnd w:id="27"/>
-    <w:bookmarkStart w:id="31" w:name="X6c9d902b90000a6974ad3fadad24d55dc75bc64"/>
+    <w:bookmarkEnd w:id="38"/>
+    <w:bookmarkEnd w:id="39"/>
+    <w:bookmarkStart w:id="48" w:name="X6c9d902b90000a6974ad3fadad24d55dc75bc64"/>
     <w:p>
       <w:pPr>
         <w:pStyle w:val="Heading1"/>
@@ -822,7 +1243,7 @@
         <w:t xml:space="preserve">wieder in den Betrieb überführt werden kann.</w:t>
       </w:r>
     </w:p>
-    <w:bookmarkStart w:id="28" w:name="X43be8b1bda9a61e7f3f81e632f710ce3fb282b4"/>
+    <w:bookmarkStart w:id="40" w:name="X43be8b1bda9a61e7f3f81e632f710ce3fb282b4"/>
     <w:p>
       <w:pPr>
         <w:pStyle w:val="Heading2"/>
@@ -933,8 +1354,8 @@
         <w:t xml:space="preserve">Ein ungeübter Plan ist funktional äquivalent zu keinem Plan.</w:t>
       </w:r>
     </w:p>
-    <w:bookmarkEnd w:id="28"/>
-    <w:bookmarkStart w:id="29" w:name="Xe4c35f236e2aafea8cb31445e38483e6743477f"/>
+    <w:bookmarkEnd w:id="40"/>
+    <w:bookmarkStart w:id="41" w:name="Xe4c35f236e2aafea8cb31445e38483e6743477f"/>
     <w:p>
       <w:pPr>
         <w:pStyle w:val="Heading2"/>
@@ -1059,8 +1480,8 @@
         <w:t xml:space="preserve">(vgl. NIST SP 800-160 Vol. 2).</w:t>
       </w:r>
     </w:p>
-    <w:bookmarkEnd w:id="29"/>
-    <w:bookmarkStart w:id="30" w:name="abgrenzung-backup-recovery"/>
+    <w:bookmarkEnd w:id="41"/>
+    <w:bookmarkStart w:id="47" w:name="abgrenzung-backup-recovery"/>
     <w:p>
       <w:pPr>
         <w:pStyle w:val="Heading2"/>
@@ -1156,9 +1577,213 @@
         <w:t xml:space="preserve">infolge ungeprüfter Abhängigkeiten, mangelhafter Automatisierung oder fehlender Rollenklärung.</w:t>
       </w:r>
     </w:p>
-    <w:bookmarkEnd w:id="30"/>
-    <w:bookmarkEnd w:id="31"/>
-    <w:bookmarkStart w:id="35" w:name="X5c73189e96fb1bc9fef3ca1ac73f16f4eb71216"/>
+    <w:p>
+      <w:pPr>
+        <w:pStyle w:val="CaptionedFigure"/>
+      </w:pPr>
+      <w:r>
+        <w:drawing>
+          <wp:inline>
+            <wp:extent cx="4602480" cy="3507248"/>
+            <wp:effectExtent b="0" l="0" r="0" t="0"/>
+            <wp:docPr descr="Recovery als Kette: Nur das erste Glied ist ein Zustand, alle weiteren sind Fähigkeiten" title="" id="43" name="Picture"/>
+            <a:graphic>
+              <a:graphicData uri="http://schemas.openxmlformats.org/drawingml/2006/picture">
+                <pic:pic>
+                  <pic:nvPicPr>
+                    <pic:cNvPr descr="../Präsentationen/Termin-03/assets/recovery-kette.png" id="44" name="Picture"/>
+                    <pic:cNvPicPr>
+                      <a:picLocks noChangeArrowheads="1" noChangeAspect="1"/>
+                    </pic:cNvPicPr>
+                  </pic:nvPicPr>
+                  <pic:blipFill>
+                    <a:blip r:embed="rId42"/>
+                    <a:stretch>
+                      <a:fillRect/>
+                    </a:stretch>
+                  </pic:blipFill>
+                  <pic:spPr bwMode="auto">
+                    <a:xfrm>
+                      <a:off x="0" y="0"/>
+                      <a:ext cx="4602480" cy="3507248"/>
+                    </a:xfrm>
+                    <a:prstGeom prst="rect">
+                      <a:avLst/>
+                    </a:prstGeom>
+                    <a:noFill/>
+                    <a:ln w="9525">
+                      <a:noFill/>
+                      <a:headEnd/>
+                      <a:tailEnd/>
+                    </a:ln>
+                  </pic:spPr>
+                </pic:pic>
+              </a:graphicData>
+            </a:graphic>
+          </wp:inline>
+        </w:drawing>
+      </w:r>
+    </w:p>
+    <w:p>
+      <w:pPr>
+        <w:pStyle w:val="ImageCaption"/>
+      </w:pPr>
+      <w:r>
+        <w:t xml:space="preserve">Recovery als Kette: Nur das erste Glied ist ein Zustand, alle weiteren sind Fähigkeiten</w:t>
+      </w:r>
+    </w:p>
+    <w:tbl>
+      <w:tblPr>
+        <w:tblStyle w:val="Table"/>
+        <w:tblLook w:firstRow="0" w:lastRow="0" w:firstColumn="0" w:lastColumn="0" w:noHBand="0" w:noVBand="0" w:val="0000"/>
+        <w:tblBorders>
+          <w:top w:val="single" w:sz="4" w:space="0" w:color="00A047"/>
+          <w:left w:val="single" w:sz="24" w:space="0" w:color="00A047"/>
+          <w:bottom w:val="single" w:sz="4" w:space="0" w:color="00A047"/>
+          <w:right w:val="single" w:sz="4" w:space="0" w:color="00A047"/>
+        </w:tblBorders>
+        <w:tblCellMar>
+          <w:left w:w="144" w:type="dxa"/>
+          <w:right w:w="144" w:type="dxa"/>
+        </w:tblCellMar>
+        <w:tblLook w:firstRow="0" w:lastRow="0" w:firstColumn="0" w:lastColumn="0" w:noHBand="0" w:noVBand="0" w:val="0000"/>
+      </w:tblPr>
+      <w:tr>
+        <w:trPr>
+          <w:cantSplit/>
+        </w:trPr>
+        <w:tc>
+          <w:tcPr>
+            <w:shd w:color="auto" w:fill="ccf1e3" w:val="clear"/>
+            <w:tcMar>
+              <w:top w:w="92" w:type="dxa"/>
+              <w:bottom w:w="92" w:type="dxa"/>
+            </w:tcMar>
+          </w:tcPr>
+          <w:p>
+            <w:pPr>
+              <w:pStyle w:val="BodyText"/>
+            </w:pPr>
+            <w:pPr>
+              <w:spacing w:before="0" w:after="0"/>
+              <w:textAlignment w:val="center"/>
+            </w:pPr>
+            <w:r>
+              <w:drawing>
+                <wp:inline>
+                  <wp:extent cx="152400" cy="152400"/>
+                  <wp:effectExtent b="0" l="0" r="0" t="0"/>
+                  <wp:docPr descr="" title="" id="45" name="Picture"/>
+                  <a:graphic>
+                    <a:graphicData uri="http://schemas.openxmlformats.org/drawingml/2006/picture">
+                      <pic:pic>
+                        <pic:nvPicPr>
+                          <pic:cNvPr descr="/usr/local/lib/python3.13/dist-packages/quarto_cli/share/formats/docx/tip.png" id="46" name="Picture"/>
+                          <pic:cNvPicPr>
+                            <a:picLocks noChangeArrowheads="1" noChangeAspect="1"/>
+                          </pic:cNvPicPr>
+                        </pic:nvPicPr>
+                        <pic:blipFill>
+                          <a:blip r:embed="rId25"/>
+                          <a:stretch>
+                            <a:fillRect/>
+                          </a:stretch>
+                        </pic:blipFill>
+                        <pic:spPr bwMode="auto">
+                          <a:xfrm>
+                            <a:off x="0" y="0"/>
+                            <a:ext cx="152400" cy="152400"/>
+                          </a:xfrm>
+                          <a:prstGeom prst="rect">
+                            <a:avLst/>
+                          </a:prstGeom>
+                          <a:noFill/>
+                          <a:ln w="9525">
+                            <a:noFill/>
+                            <a:headEnd/>
+                            <a:tailEnd/>
+                          </a:ln>
+                        </pic:spPr>
+                      </pic:pic>
+                    </a:graphicData>
+                  </a:graphic>
+                </wp:inline>
+              </w:drawing>
+            </w:r>
+            <w:r>
+              <w:t xml:space="preserve"> </w:t>
+            </w:r>
+            <w:r>
+              <w:t xml:space="preserve"> </w:t>
+            </w:r>
+            <w:r>
+              <w:t xml:space="preserve">Ergänzung zur Vorlesung: Rackspace 2022</w:t>
+            </w:r>
+          </w:p>
+        </w:tc>
+      </w:tr>
+      <w:tr>
+        <w:trPr>
+          <w:cantSplit/>
+        </w:trPr>
+        <w:tc>
+          <w:tcPr>
+            <w:tcMar>
+              <w:top w:w="108" w:type="dxa"/>
+              <w:bottom w:w="108" w:type="dxa"/>
+            </w:tcMar>
+          </w:tcPr>
+          <w:p>
+            <w:pPr>
+              <w:pStyle w:val="BodyText"/>
+            </w:pPr>
+            <w:pPr>
+              <w:spacing w:before="16"/>
+            </w:pPr>
+            <w:r>
+              <w:t xml:space="preserve">Im November 2022 veröffentlichte Microsoft einen Patch für die Exchange-Lücke „ProxyNotShell“. Der Hosting-Anbieter Rackspace spielte ihn aus Sorge vor Anmeldeproblemen nicht ein und verließ sich auf vorläufige Workarounds. Am 2. Dezember 2022 umging die Ransomware-Gruppe Play diese Workarounds und legte den Dienst Hosted Exchange lahm. Anfang Januar 2023 entschied Rackspace, die Umgebung nicht wieder aufzubauen, sondern den Dienst einzustellen und die Kunden zu Microsoft 365 zu migrieren.</w:t>
+            </w:r>
+          </w:p>
+          <w:p>
+            <w:pPr>
+              <w:pStyle w:val="BodyText"/>
+            </w:pPr>
+            <w:r>
+              <w:t xml:space="preserve">Für die Kunden war das RTO des alten Dienstes damit faktisch unendlich. Der Fall zeigt, dass Recovery nicht nur eine technische, sondern auch eine wirtschaftliche Entscheidung ist – und dass Kunden eines Dienstleisters eine eigene Exit- und Wiederherstellungsstrategie brauchen.</w:t>
+            </w:r>
+          </w:p>
+          <w:p>
+            <w:pPr>
+              <w:pStyle w:val="BodyText"/>
+            </w:pPr>
+            <w:pPr>
+              <w:spacing w:after="16"/>
+            </w:pPr>
+            <w:r>
+              <w:t xml:space="preserve">Quellenangaben unter</w:t>
+            </w:r>
+            <w:r>
+              <w:t xml:space="preserve"> </w:t>
+            </w:r>
+            <w:hyperlink r:id="rId28">
+              <w:r>
+                <w:rPr>
+                  <w:rStyle w:val="Hyperlink"/>
+                </w:rPr>
+                <w:t xml:space="preserve">Quellen</w:t>
+              </w:r>
+            </w:hyperlink>
+            <w:r>
+              <w:t xml:space="preserve">.</w:t>
+            </w:r>
+          </w:p>
+          <w:p/>
+        </w:tc>
+      </w:tr>
+    </w:tbl>
+    <w:bookmarkEnd w:id="47"/>
+    <w:bookmarkEnd w:id="48"/>
+    <w:bookmarkStart w:id="54" w:name="X5c73189e96fb1bc9fef3ca1ac73f16f4eb71216"/>
     <w:p>
       <w:pPr>
         <w:pStyle w:val="Heading1"/>
@@ -1188,7 +1813,7 @@
         <w:t xml:space="preserve">, ohne Funktionsverlust als Ganzes. Adaptivität ist damit eine aktive Resilienzleistung — kein statisches Designmerkmal.</w:t>
       </w:r>
     </w:p>
-    <w:bookmarkStart w:id="32" w:name="formen-adaptiver-resilienzmechanismen"/>
+    <w:bookmarkStart w:id="49" w:name="formen-adaptiver-resilienzmechanismen"/>
     <w:p>
       <w:pPr>
         <w:pStyle w:val="Heading2"/>
@@ -1289,8 +1914,8 @@
         <w:t xml:space="preserve">Diese Mechanismen verhindern binäre Zustandswechsel („an/aus“) und erzeugen „abgestufte Überlebensfähigkeit“.</w:t>
       </w:r>
     </w:p>
-    <w:bookmarkEnd w:id="32"/>
-    <w:bookmarkStart w:id="33" w:name="X9194f9148e2b47652f263f06cb4842cd02f7a54"/>
+    <w:bookmarkEnd w:id="49"/>
+    <w:bookmarkStart w:id="52" w:name="X9194f9148e2b47652f263f06cb4842cd02f7a54"/>
     <w:p>
       <w:pPr>
         <w:pStyle w:val="Heading2"/>
@@ -1343,8 +1968,157 @@
         <w:t xml:space="preserve">NIST SP 800-160 Vol.2 ordnet adaptives Verhalten den Fähigkeiten „respond“, „recover“ und „adapt“ zu und positioniert es als lernfähigen Prozess statt als statischen Architekturstatus.</w:t>
       </w:r>
     </w:p>
-    <w:bookmarkEnd w:id="33"/>
-    <w:bookmarkStart w:id="34" w:name="grenzen-der-adaptivität"/>
+    <w:tbl>
+      <w:tblPr>
+        <w:tblStyle w:val="Table"/>
+        <w:tblLook w:firstRow="0" w:lastRow="0" w:firstColumn="0" w:lastColumn="0" w:noHBand="0" w:noVBand="0" w:val="0000"/>
+        <w:tblBorders>
+          <w:top w:val="single" w:sz="4" w:space="0" w:color="00A047"/>
+          <w:left w:val="single" w:sz="24" w:space="0" w:color="00A047"/>
+          <w:bottom w:val="single" w:sz="4" w:space="0" w:color="00A047"/>
+          <w:right w:val="single" w:sz="4" w:space="0" w:color="00A047"/>
+        </w:tblBorders>
+        <w:tblCellMar>
+          <w:left w:w="144" w:type="dxa"/>
+          <w:right w:w="144" w:type="dxa"/>
+        </w:tblCellMar>
+        <w:tblLook w:firstRow="0" w:lastRow="0" w:firstColumn="0" w:lastColumn="0" w:noHBand="0" w:noVBand="0" w:val="0000"/>
+      </w:tblPr>
+      <w:tr>
+        <w:trPr>
+          <w:cantSplit/>
+        </w:trPr>
+        <w:tc>
+          <w:tcPr>
+            <w:shd w:color="auto" w:fill="ccf1e3" w:val="clear"/>
+            <w:tcMar>
+              <w:top w:w="92" w:type="dxa"/>
+              <w:bottom w:w="92" w:type="dxa"/>
+            </w:tcMar>
+          </w:tcPr>
+          <w:p>
+            <w:pPr>
+              <w:pStyle w:val="BodyText"/>
+            </w:pPr>
+            <w:pPr>
+              <w:spacing w:before="0" w:after="0"/>
+              <w:textAlignment w:val="center"/>
+            </w:pPr>
+            <w:r>
+              <w:drawing>
+                <wp:inline>
+                  <wp:extent cx="152400" cy="152400"/>
+                  <wp:effectExtent b="0" l="0" r="0" t="0"/>
+                  <wp:docPr descr="" title="" id="50" name="Picture"/>
+                  <a:graphic>
+                    <a:graphicData uri="http://schemas.openxmlformats.org/drawingml/2006/picture">
+                      <pic:pic>
+                        <pic:nvPicPr>
+                          <pic:cNvPr descr="/usr/local/lib/python3.13/dist-packages/quarto_cli/share/formats/docx/tip.png" id="51" name="Picture"/>
+                          <pic:cNvPicPr>
+                            <a:picLocks noChangeArrowheads="1" noChangeAspect="1"/>
+                          </pic:cNvPicPr>
+                        </pic:nvPicPr>
+                        <pic:blipFill>
+                          <a:blip r:embed="rId25"/>
+                          <a:stretch>
+                            <a:fillRect/>
+                          </a:stretch>
+                        </pic:blipFill>
+                        <pic:spPr bwMode="auto">
+                          <a:xfrm>
+                            <a:off x="0" y="0"/>
+                            <a:ext cx="152400" cy="152400"/>
+                          </a:xfrm>
+                          <a:prstGeom prst="rect">
+                            <a:avLst/>
+                          </a:prstGeom>
+                          <a:noFill/>
+                          <a:ln w="9525">
+                            <a:noFill/>
+                            <a:headEnd/>
+                            <a:tailEnd/>
+                          </a:ln>
+                        </pic:spPr>
+                      </pic:pic>
+                    </a:graphicData>
+                  </a:graphic>
+                </wp:inline>
+              </w:drawing>
+            </w:r>
+            <w:r>
+              <w:t xml:space="preserve"> </w:t>
+            </w:r>
+            <w:r>
+              <w:t xml:space="preserve"> </w:t>
+            </w:r>
+            <w:r>
+              <w:t xml:space="preserve">Ergänzung zur Vorlesung: Netflix und der AWS-Ausfall 2011</w:t>
+            </w:r>
+          </w:p>
+        </w:tc>
+      </w:tr>
+      <w:tr>
+        <w:trPr>
+          <w:cantSplit/>
+        </w:trPr>
+        <w:tc>
+          <w:tcPr>
+            <w:tcMar>
+              <w:top w:w="108" w:type="dxa"/>
+              <w:bottom w:w="108" w:type="dxa"/>
+            </w:tcMar>
+          </w:tcPr>
+          <w:p>
+            <w:pPr>
+              <w:pStyle w:val="BodyText"/>
+            </w:pPr>
+            <w:pPr>
+              <w:spacing w:before="16"/>
+            </w:pPr>
+            <w:r>
+              <w:t xml:space="preserve">Am 21. April 2011 war eine Zone der AWS-Region US-East gestört; viele bekannte Dienste waren offline. Netflix lief weiter, wenn auch mit höherer Fehlerrate und Latenz. Gründe laut Netflix: zustandslose Dienste, Verteilung auf drei aktive Zonen und vorgehaltene Reservekapazität. Chaos Monkey hatte Instanzausfälle zur Routine gemacht.</w:t>
+            </w:r>
+          </w:p>
+          <w:p>
+            <w:pPr>
+              <w:pStyle w:val="BodyText"/>
+            </w:pPr>
+            <w:r>
+              <w:t xml:space="preserve">Netflix benannte aber auch die Lücke: Einen Ausfall einer ganzen Zone hatte Chaos Monkey nicht simuliert, die Umleitung lief deshalb teilweise manuell. Daraus entstanden weitere Werkzeuge, die gezielt größere Ausfälle üben. Adaptivität ist also nur so gut wie die Störungen, mit denen sie trainiert wurde.</w:t>
+            </w:r>
+          </w:p>
+          <w:p>
+            <w:pPr>
+              <w:pStyle w:val="BodyText"/>
+            </w:pPr>
+            <w:pPr>
+              <w:spacing w:after="16"/>
+            </w:pPr>
+            <w:r>
+              <w:t xml:space="preserve">Quellenangaben unter</w:t>
+            </w:r>
+            <w:r>
+              <w:t xml:space="preserve"> </w:t>
+            </w:r>
+            <w:hyperlink r:id="rId28">
+              <w:r>
+                <w:rPr>
+                  <w:rStyle w:val="Hyperlink"/>
+                </w:rPr>
+                <w:t xml:space="preserve">Quellen</w:t>
+              </w:r>
+            </w:hyperlink>
+            <w:r>
+              <w:t xml:space="preserve">.</w:t>
+            </w:r>
+          </w:p>
+          <w:p/>
+        </w:tc>
+      </w:tr>
+    </w:tbl>
+    <w:bookmarkEnd w:id="52"/>
+    <w:bookmarkStart w:id="53" w:name="grenzen-der-adaptivität"/>
     <w:p>
       <w:pPr>
         <w:pStyle w:val="Heading2"/>
@@ -1382,9 +2156,9 @@
         <w:t xml:space="preserve">Adaptivität ist deshalb ein Multiplikator, kein Ersatz für die anderen Prinzipien.</w:t>
       </w:r>
     </w:p>
-    <w:bookmarkEnd w:id="34"/>
-    <w:bookmarkEnd w:id="35"/>
-    <w:bookmarkStart w:id="39" w:name="Xe990c09a50fb167fa6df00f7fb250f9eadc5870"/>
+    <w:bookmarkEnd w:id="53"/>
+    <w:bookmarkEnd w:id="54"/>
+    <w:bookmarkStart w:id="63" w:name="Xe990c09a50fb167fa6df00f7fb250f9eadc5870"/>
     <w:p>
       <w:pPr>
         <w:pStyle w:val="Heading1"/>
@@ -1414,7 +2188,7 @@
         <w:t xml:space="preserve">. Hybrid erhöht stets die Zahl der Komponenten, aber nicht zwangsläufig die Zahl der Ausfallpfade.</w:t>
       </w:r>
     </w:p>
-    <w:bookmarkStart w:id="36" w:name="resilienzpotenziale-im-hybridbetrieb"/>
+    <w:bookmarkStart w:id="55" w:name="resilienzpotenziale-im-hybridbetrieb"/>
     <w:p>
       <w:pPr>
         <w:pStyle w:val="Heading2"/>
@@ -1525,8 +2299,8 @@
         <w:t xml:space="preserve">zu implementieren statt rein physisch.</w:t>
       </w:r>
     </w:p>
-    <w:bookmarkEnd w:id="36"/>
-    <w:bookmarkStart w:id="37" w:name="hybrid-spofs-neue-fragilitätsquellen"/>
+    <w:bookmarkEnd w:id="55"/>
+    <w:bookmarkStart w:id="61" w:name="hybrid-spofs-neue-fragilitätsquellen"/>
     <w:p>
       <w:pPr>
         <w:pStyle w:val="Heading2"/>
@@ -1648,8 +2422,212 @@
         <w:t xml:space="preserve">Ein System kann funktional verteilt sein, aber steuerungstechnisch monolithisch — und damit fragil.</w:t>
       </w:r>
     </w:p>
-    <w:bookmarkEnd w:id="37"/>
-    <w:bookmarkStart w:id="38" w:name="hybrid-verlangt-doppelte-resilienzlogik"/>
+    <w:tbl>
+      <w:tblPr>
+        <w:tblStyle w:val="Table"/>
+        <w:tblLook w:firstRow="0" w:lastRow="0" w:firstColumn="0" w:lastColumn="0" w:noHBand="0" w:noVBand="0" w:val="0000"/>
+        <w:tblBorders>
+          <w:top w:val="single" w:sz="4" w:space="0" w:color="00A047"/>
+          <w:left w:val="single" w:sz="24" w:space="0" w:color="00A047"/>
+          <w:bottom w:val="single" w:sz="4" w:space="0" w:color="00A047"/>
+          <w:right w:val="single" w:sz="4" w:space="0" w:color="00A047"/>
+        </w:tblBorders>
+        <w:tblCellMar>
+          <w:left w:w="144" w:type="dxa"/>
+          <w:right w:w="144" w:type="dxa"/>
+        </w:tblCellMar>
+        <w:tblLook w:firstRow="0" w:lastRow="0" w:firstColumn="0" w:lastColumn="0" w:noHBand="0" w:noVBand="0" w:val="0000"/>
+      </w:tblPr>
+      <w:tr>
+        <w:trPr>
+          <w:cantSplit/>
+        </w:trPr>
+        <w:tc>
+          <w:tcPr>
+            <w:shd w:color="auto" w:fill="ccf1e3" w:val="clear"/>
+            <w:tcMar>
+              <w:top w:w="92" w:type="dxa"/>
+              <w:bottom w:w="92" w:type="dxa"/>
+            </w:tcMar>
+          </w:tcPr>
+          <w:p>
+            <w:pPr>
+              <w:pStyle w:val="BodyText"/>
+            </w:pPr>
+            <w:pPr>
+              <w:spacing w:before="0" w:after="0"/>
+              <w:textAlignment w:val="center"/>
+            </w:pPr>
+            <w:r>
+              <w:drawing>
+                <wp:inline>
+                  <wp:extent cx="152400" cy="152400"/>
+                  <wp:effectExtent b="0" l="0" r="0" t="0"/>
+                  <wp:docPr descr="" title="" id="56" name="Picture"/>
+                  <a:graphic>
+                    <a:graphicData uri="http://schemas.openxmlformats.org/drawingml/2006/picture">
+                      <pic:pic>
+                        <pic:nvPicPr>
+                          <pic:cNvPr descr="/usr/local/lib/python3.13/dist-packages/quarto_cli/share/formats/docx/tip.png" id="57" name="Picture"/>
+                          <pic:cNvPicPr>
+                            <a:picLocks noChangeArrowheads="1" noChangeAspect="1"/>
+                          </pic:cNvPicPr>
+                        </pic:nvPicPr>
+                        <pic:blipFill>
+                          <a:blip r:embed="rId25"/>
+                          <a:stretch>
+                            <a:fillRect/>
+                          </a:stretch>
+                        </pic:blipFill>
+                        <pic:spPr bwMode="auto">
+                          <a:xfrm>
+                            <a:off x="0" y="0"/>
+                            <a:ext cx="152400" cy="152400"/>
+                          </a:xfrm>
+                          <a:prstGeom prst="rect">
+                            <a:avLst/>
+                          </a:prstGeom>
+                          <a:noFill/>
+                          <a:ln w="9525">
+                            <a:noFill/>
+                            <a:headEnd/>
+                            <a:tailEnd/>
+                          </a:ln>
+                        </pic:spPr>
+                      </pic:pic>
+                    </a:graphicData>
+                  </a:graphic>
+                </wp:inline>
+              </w:drawing>
+            </w:r>
+            <w:r>
+              <w:t xml:space="preserve"> </w:t>
+            </w:r>
+            <w:r>
+              <w:t xml:space="preserve"> </w:t>
+            </w:r>
+            <w:r>
+              <w:t xml:space="preserve">Ergänzung zur Vorlesung: Facebook 2021</w:t>
+            </w:r>
+          </w:p>
+        </w:tc>
+      </w:tr>
+      <w:tr>
+        <w:trPr>
+          <w:cantSplit/>
+        </w:trPr>
+        <w:tc>
+          <w:tcPr>
+            <w:tcMar>
+              <w:top w:w="108" w:type="dxa"/>
+              <w:bottom w:w="108" w:type="dxa"/>
+            </w:tcMar>
+          </w:tcPr>
+          <w:p>
+            <w:pPr>
+              <w:pStyle w:val="BodyText"/>
+            </w:pPr>
+            <w:pPr>
+              <w:spacing w:before="16"/>
+            </w:pPr>
+            <w:r>
+              <w:t xml:space="preserve">Am 4. Oktober 2021 trennte ein Wartungsbefehl versehentlich alle Verbindungen im Backbone von Facebook; ein Fehler im Prüfwerkzeug verhinderte, dass er gestoppt wurde. Die DNS-Server zogen daraufhin – wie vorgesehen – ihre BGP-Routen zurück. Facebook, Instagram und WhatsApp waren rund sechs Stunden weltweit nicht erreichbar. Auch interne Werkzeuge und der Fernzugriff fielen aus, sodass Techniker vor Ort in die Rechenzentren mussten; die strengen Zutrittsregeln verzögerten die Wiederherstellung zusätzlich.</w:t>
+            </w:r>
+          </w:p>
+          <w:p>
+            <w:pPr>
+              <w:pStyle w:val="BodyText"/>
+            </w:pPr>
+            <w:r>
+              <w:t xml:space="preserve">Der Fall zeigt den Hybrid-SPOF im großen Maßstab: Tausende redundante Server, aber eine gemeinsame Steuerungsebene. Zugleich wird sichtbar, dass Sicherheitsmaßnahmen die Wiederherstellung verlangsamen können.</w:t>
+            </w:r>
+          </w:p>
+          <w:p>
+            <w:pPr>
+              <w:pStyle w:val="BodyText"/>
+            </w:pPr>
+            <w:pPr>
+              <w:spacing w:after="16"/>
+            </w:pPr>
+            <w:r>
+              <w:t xml:space="preserve">Quellenangaben unter</w:t>
+            </w:r>
+            <w:r>
+              <w:t xml:space="preserve"> </w:t>
+            </w:r>
+            <w:hyperlink r:id="rId28">
+              <w:r>
+                <w:rPr>
+                  <w:rStyle w:val="Hyperlink"/>
+                </w:rPr>
+                <w:t xml:space="preserve">Quellen</w:t>
+              </w:r>
+            </w:hyperlink>
+            <w:r>
+              <w:t xml:space="preserve">.</w:t>
+            </w:r>
+          </w:p>
+          <w:p/>
+        </w:tc>
+      </w:tr>
+    </w:tbl>
+    <w:p>
+      <w:pPr>
+        <w:pStyle w:val="CaptionedFigure"/>
+      </w:pPr>
+      <w:r>
+        <w:drawing>
+          <wp:inline>
+            <wp:extent cx="4314825" cy="3288045"/>
+            <wp:effectExtent b="0" l="0" r="0" t="0"/>
+            <wp:docPr descr="Facebook 2021: Die Datenebene war verteilt, die Steuerungsebene gemeinsam" title="" id="59" name="Picture"/>
+            <a:graphic>
+              <a:graphicData uri="http://schemas.openxmlformats.org/drawingml/2006/picture">
+                <pic:pic>
+                  <pic:nvPicPr>
+                    <pic:cNvPr descr="../Präsentationen/Termin-03/assets/facebook-2021-kopplung.png" id="60" name="Picture"/>
+                    <pic:cNvPicPr>
+                      <a:picLocks noChangeArrowheads="1" noChangeAspect="1"/>
+                    </pic:cNvPicPr>
+                  </pic:nvPicPr>
+                  <pic:blipFill>
+                    <a:blip r:embed="rId58"/>
+                    <a:stretch>
+                      <a:fillRect/>
+                    </a:stretch>
+                  </pic:blipFill>
+                  <pic:spPr bwMode="auto">
+                    <a:xfrm>
+                      <a:off x="0" y="0"/>
+                      <a:ext cx="4314825" cy="3288045"/>
+                    </a:xfrm>
+                    <a:prstGeom prst="rect">
+                      <a:avLst/>
+                    </a:prstGeom>
+                    <a:noFill/>
+                    <a:ln w="9525">
+                      <a:noFill/>
+                      <a:headEnd/>
+                      <a:tailEnd/>
+                    </a:ln>
+                  </pic:spPr>
+                </pic:pic>
+              </a:graphicData>
+            </a:graphic>
+          </wp:inline>
+        </w:drawing>
+      </w:r>
+    </w:p>
+    <w:p>
+      <w:pPr>
+        <w:pStyle w:val="ImageCaption"/>
+      </w:pPr>
+      <w:r>
+        <w:t xml:space="preserve">Facebook 2021: Die Datenebene war verteilt, die Steuerungsebene gemeinsam</w:t>
+      </w:r>
+    </w:p>
+    <w:bookmarkEnd w:id="61"/>
+    <w:bookmarkStart w:id="62" w:name="hybrid-verlangt-doppelte-resilienzlogik"/>
     <w:p>
       <w:pPr>
         <w:pStyle w:val="Heading2"/>
@@ -1761,9 +2739,9 @@
         <w:t xml:space="preserve">. Resilienzgewinne entstehen nur, wenn die neuen Freiheitsgrade bewusst genutzt werden.</w:t>
       </w:r>
     </w:p>
-    <w:bookmarkEnd w:id="38"/>
-    <w:bookmarkEnd w:id="39"/>
-    <w:bookmarkStart w:id="40" w:name="X4e925317d058ad920fa952649da69ce06a49986"/>
+    <w:bookmarkEnd w:id="62"/>
+    <w:bookmarkEnd w:id="63"/>
+    <w:bookmarkStart w:id="64" w:name="X4e925317d058ad920fa952649da69ce06a49986"/>
     <w:p>
       <w:pPr>
         <w:pStyle w:val="Heading1"/>
@@ -1946,8 +2924,8 @@
         <w:t xml:space="preserve">.</w:t>
       </w:r>
     </w:p>
-    <w:bookmarkEnd w:id="40"/>
-    <w:bookmarkStart w:id="41" w:name="zusammenfassung-prüfungsrelevanz"/>
+    <w:bookmarkEnd w:id="64"/>
+    <w:bookmarkStart w:id="65" w:name="zusammenfassung-prüfungsrelevanz"/>
     <w:p>
       <w:pPr>
         <w:pStyle w:val="Heading1"/>
@@ -1985,8 +2963,8 @@
         <w:t xml:space="preserve">In hybriden Architekturen erhöht sich der Suchraum für Verwundbarkeit — aber auch der Werkzeugkasten für Resilienz.</w:t>
       </w:r>
     </w:p>
-    <w:bookmarkEnd w:id="41"/>
-    <w:bookmarkStart w:id="42" w:name="prüfungsrelevante-leitfragen"/>
+    <w:bookmarkEnd w:id="65"/>
+    <w:bookmarkStart w:id="66" w:name="prüfungsrelevante-leitfragen"/>
     <w:p>
       <w:pPr>
         <w:pStyle w:val="Heading1"/>
@@ -2057,7 +3035,7 @@
         <w:t xml:space="preserve">NIST SP 800-160 Vol. 2 (Resilience Engineering), ISO/IEC 27031 (ICT Readiness for BC), BSI-200-4 (BCM-Reifegrad), ENISA-Guidance (Supply-Chain-Resilience).</w:t>
       </w:r>
     </w:p>
-    <w:bookmarkEnd w:id="42"/>
+    <w:bookmarkEnd w:id="66"/>
     <w:sectPr>
       <w:headerReference r:id="rId9" w:type="default"/>
       <w:footerReference r:id="rId10" w:type="default"/>

</xml_diff>